<commit_message>
minor change in source file
</commit_message>
<xml_diff>
--- a/source/AdnanShatilCV.docx
+++ b/source/AdnanShatilCV.docx
@@ -570,8 +570,19 @@
                 <w:szCs w:val="16"/>
                 <w:lang w:val="en-GB" w:bidi="bn-IN"/>
               </w:rPr>
-              <w:t>linkedin.com/in/adnanshatil</w:t>
-            </w:r>
+              <w:t>linkedin.com/in/</w:t>
+            </w:r>
+            <w:proofErr w:type="spellStart"/>
+            <w:r>
+              <w:rPr>
+                <w:rFonts w:cstheme="minorHAnsi"/>
+                <w:sz w:val="16"/>
+                <w:szCs w:val="16"/>
+                <w:lang w:val="en-GB" w:bidi="bn-IN"/>
+              </w:rPr>
+              <w:t>adnanshatil</w:t>
+            </w:r>
+            <w:proofErr w:type="spellEnd"/>
           </w:p>
         </w:tc>
         <w:tc>
@@ -590,6 +601,7 @@
                 <w:lang w:val="fi-FI"/>
               </w:rPr>
             </w:pPr>
+            <w:proofErr w:type="spellStart"/>
             <w:r>
               <w:rPr>
                 <w:rFonts w:cstheme="minorHAnsi"/>
@@ -602,6 +614,7 @@
               </w:rPr>
               <w:t>Github</w:t>
             </w:r>
+            <w:proofErr w:type="spellEnd"/>
           </w:p>
         </w:tc>
         <w:tc>
@@ -625,8 +638,19 @@
                 <w:szCs w:val="16"/>
                 <w:lang w:val="en-GB" w:bidi="bn-IN"/>
               </w:rPr>
-              <w:t>github.com/adnanshatil</w:t>
-            </w:r>
+              <w:t>github.com/</w:t>
+            </w:r>
+            <w:proofErr w:type="spellStart"/>
+            <w:r>
+              <w:rPr>
+                <w:rFonts w:cstheme="minorHAnsi"/>
+                <w:sz w:val="16"/>
+                <w:szCs w:val="16"/>
+                <w:lang w:val="en-GB" w:bidi="bn-IN"/>
+              </w:rPr>
+              <w:t>adnanshatil</w:t>
+            </w:r>
+            <w:proofErr w:type="spellEnd"/>
           </w:p>
         </w:tc>
       </w:tr>
@@ -1561,8 +1585,22 @@
                 <w:szCs w:val="16"/>
                 <w:lang w:val="fi-FI"/>
               </w:rPr>
-              <w:t xml:space="preserve"> Present</w:t>
-            </w:r>
+              <w:t xml:space="preserve"> </w:t>
+            </w:r>
+            <w:proofErr w:type="spellStart"/>
+            <w:r>
+              <w:rPr>
+                <w:rFonts w:cstheme="minorHAnsi"/>
+                <w:i/>
+                <w:iCs/>
+                <w:color w:val="808080" w:themeColor="background1" w:themeShade="80"/>
+                <w:sz w:val="16"/>
+                <w:szCs w:val="16"/>
+                <w:lang w:val="fi-FI"/>
+              </w:rPr>
+              <w:t>Present</w:t>
+            </w:r>
+            <w:proofErr w:type="spellEnd"/>
           </w:p>
         </w:tc>
         <w:tc>
@@ -1750,6 +1788,7 @@
                 <w:lang w:val="fi-FI"/>
               </w:rPr>
             </w:pPr>
+            <w:proofErr w:type="spellStart"/>
             <w:r>
               <w:rPr>
                 <w:rFonts w:cstheme="minorHAnsi"/>
@@ -1757,20 +1796,50 @@
                 <w:szCs w:val="18"/>
                 <w:lang w:val="fi-FI"/>
               </w:rPr>
-              <w:t>Corsearch (TrademarkNow Oy)</w:t>
-            </w:r>
-          </w:p>
-        </w:tc>
-        <w:tc>
-          <w:tcPr>
-            <w:tcW w:w="5225" w:type="dxa"/>
-          </w:tcPr>
-          <w:p>
-            <w:pPr>
+              <w:t>Corsearch</w:t>
+            </w:r>
+            <w:proofErr w:type="spellEnd"/>
+            <w:r>
               <w:rPr>
                 <w:rFonts w:cstheme="minorHAnsi"/>
                 <w:sz w:val="18"/>
                 <w:szCs w:val="18"/>
+                <w:lang w:val="fi-FI"/>
+              </w:rPr>
+              <w:t xml:space="preserve"> (</w:t>
+            </w:r>
+            <w:proofErr w:type="spellStart"/>
+            <w:r>
+              <w:rPr>
+                <w:rFonts w:cstheme="minorHAnsi"/>
+                <w:sz w:val="18"/>
+                <w:szCs w:val="18"/>
+                <w:lang w:val="fi-FI"/>
+              </w:rPr>
+              <w:t>TrademarkNow</w:t>
+            </w:r>
+            <w:proofErr w:type="spellEnd"/>
+            <w:r>
+              <w:rPr>
+                <w:rFonts w:cstheme="minorHAnsi"/>
+                <w:sz w:val="18"/>
+                <w:szCs w:val="18"/>
+                <w:lang w:val="fi-FI"/>
+              </w:rPr>
+              <w:t xml:space="preserve"> Oy)</w:t>
+            </w:r>
+          </w:p>
+        </w:tc>
+        <w:tc>
+          <w:tcPr>
+            <w:tcW w:w="5225" w:type="dxa"/>
+          </w:tcPr>
+          <w:p>
+            <w:pPr>
+              <w:rPr>
+                <w:rFonts w:cstheme="minorHAnsi"/>
+                <w:sz w:val="18"/>
+                <w:szCs w:val="18"/>
               </w:rPr>
             </w:pPr>
           </w:p>
@@ -1827,7 +1896,20 @@
                 <w:szCs w:val="16"/>
                 <w:lang w:val="fi-FI"/>
               </w:rPr>
-              <w:t>/202</w:t>
+              <w:t>/</w:t>
+            </w:r>
+            <w:proofErr w:type="gramStart"/>
+            <w:r>
+              <w:rPr>
+                <w:rFonts w:cstheme="minorHAnsi"/>
+                <w:i/>
+                <w:iCs/>
+                <w:color w:val="808080" w:themeColor="background1" w:themeShade="80"/>
+                <w:sz w:val="16"/>
+                <w:szCs w:val="16"/>
+                <w:lang w:val="fi-FI"/>
+              </w:rPr>
+              <w:t>202</w:t>
             </w:r>
             <w:r>
               <w:rPr>
@@ -1875,7 +1957,20 @@
                 <w:szCs w:val="16"/>
                 <w:lang w:val="fi-FI"/>
               </w:rPr>
-              <w:t>10/2024</w:t>
+              <w:t>10</w:t>
+            </w:r>
+            <w:proofErr w:type="gramEnd"/>
+            <w:r>
+              <w:rPr>
+                <w:rFonts w:cstheme="minorHAnsi"/>
+                <w:i/>
+                <w:iCs/>
+                <w:color w:val="808080" w:themeColor="background1" w:themeShade="80"/>
+                <w:sz w:val="16"/>
+                <w:szCs w:val="16"/>
+                <w:lang w:val="fi-FI"/>
+              </w:rPr>
+              <w:t>/2024</w:t>
             </w:r>
           </w:p>
         </w:tc>
@@ -2164,20 +2259,44 @@
                 <w:szCs w:val="18"/>
                 <w:lang w:val="fi-FI"/>
               </w:rPr>
-              <w:t>Senior Solution Architect</w:t>
-            </w:r>
-          </w:p>
-        </w:tc>
-        <w:tc>
-          <w:tcPr>
-            <w:tcW w:w="5225" w:type="dxa"/>
-          </w:tcPr>
-          <w:p>
-            <w:pPr>
-              <w:rPr>
-                <w:rFonts w:cstheme="minorHAnsi"/>
+              <w:t xml:space="preserve">Senior </w:t>
+            </w:r>
+            <w:proofErr w:type="spellStart"/>
+            <w:r>
+              <w:rPr>
+                <w:rFonts w:cstheme="minorHAnsi"/>
+                <w:b/>
+                <w:bCs/>
                 <w:sz w:val="18"/>
                 <w:szCs w:val="18"/>
+                <w:lang w:val="fi-FI"/>
+              </w:rPr>
+              <w:t>Solution</w:t>
+            </w:r>
+            <w:proofErr w:type="spellEnd"/>
+            <w:r>
+              <w:rPr>
+                <w:rFonts w:cstheme="minorHAnsi"/>
+                <w:b/>
+                <w:bCs/>
+                <w:sz w:val="18"/>
+                <w:szCs w:val="18"/>
+                <w:lang w:val="fi-FI"/>
+              </w:rPr>
+              <w:t xml:space="preserve"> Architect</w:t>
+            </w:r>
+          </w:p>
+        </w:tc>
+        <w:tc>
+          <w:tcPr>
+            <w:tcW w:w="5225" w:type="dxa"/>
+          </w:tcPr>
+          <w:p>
+            <w:pPr>
+              <w:rPr>
+                <w:rFonts w:cstheme="minorHAnsi"/>
+                <w:sz w:val="18"/>
+                <w:szCs w:val="18"/>
               </w:rPr>
             </w:pPr>
           </w:p>
@@ -2198,6 +2317,7 @@
                 <w:lang w:val="fi-FI"/>
               </w:rPr>
             </w:pPr>
+            <w:proofErr w:type="spellStart"/>
             <w:r>
               <w:rPr>
                 <w:rFonts w:cstheme="minorHAnsi"/>
@@ -2205,20 +2325,30 @@
                 <w:szCs w:val="18"/>
                 <w:lang w:val="fi-FI"/>
               </w:rPr>
-              <w:t>TietoEvry Oy</w:t>
-            </w:r>
-          </w:p>
-        </w:tc>
-        <w:tc>
-          <w:tcPr>
-            <w:tcW w:w="5225" w:type="dxa"/>
-          </w:tcPr>
-          <w:p>
-            <w:pPr>
+              <w:t>TietoEvry</w:t>
+            </w:r>
+            <w:proofErr w:type="spellEnd"/>
+            <w:r>
               <w:rPr>
                 <w:rFonts w:cstheme="minorHAnsi"/>
                 <w:sz w:val="18"/>
                 <w:szCs w:val="18"/>
+                <w:lang w:val="fi-FI"/>
+              </w:rPr>
+              <w:t xml:space="preserve"> Oy</w:t>
+            </w:r>
+          </w:p>
+        </w:tc>
+        <w:tc>
+          <w:tcPr>
+            <w:tcW w:w="5225" w:type="dxa"/>
+          </w:tcPr>
+          <w:p>
+            <w:pPr>
+              <w:rPr>
+                <w:rFonts w:cstheme="minorHAnsi"/>
+                <w:sz w:val="18"/>
+                <w:szCs w:val="18"/>
               </w:rPr>
             </w:pPr>
           </w:p>
@@ -2251,7 +2381,20 @@
                 <w:szCs w:val="16"/>
                 <w:lang w:val="fi-FI"/>
               </w:rPr>
-              <w:t>04/2020</w:t>
+              <w:t>04/</w:t>
+            </w:r>
+            <w:proofErr w:type="gramStart"/>
+            <w:r>
+              <w:rPr>
+                <w:rFonts w:cstheme="minorHAnsi"/>
+                <w:i/>
+                <w:iCs/>
+                <w:color w:val="808080" w:themeColor="background1" w:themeShade="80"/>
+                <w:sz w:val="16"/>
+                <w:szCs w:val="16"/>
+                <w:lang w:val="fi-FI"/>
+              </w:rPr>
+              <w:t>2020</w:t>
             </w:r>
             <w:r>
               <w:rPr>
@@ -2313,6 +2456,7 @@
               </w:rPr>
               <w:t>6</w:t>
             </w:r>
+            <w:proofErr w:type="gramEnd"/>
             <w:r>
               <w:rPr>
                 <w:rFonts w:cstheme="minorHAnsi"/>
@@ -2466,14 +2610,25 @@
               </w:rPr>
               <w:t>C</w:t>
             </w:r>
-            <w:r>
-              <w:rPr>
-                <w:rFonts w:cstheme="minorHAnsi"/>
-                <w:sz w:val="16"/>
-                <w:szCs w:val="16"/>
-                <w:lang w:val="en-GB" w:bidi="bn-IN"/>
-              </w:rPr>
-              <w:t xml:space="preserve">ollaboration </w:t>
+            <w:proofErr w:type="spellStart"/>
+            <w:r>
+              <w:rPr>
+                <w:rFonts w:cstheme="minorHAnsi"/>
+                <w:sz w:val="16"/>
+                <w:szCs w:val="16"/>
+                <w:lang w:val="en-GB" w:bidi="bn-IN"/>
+              </w:rPr>
+              <w:t>ollaboration</w:t>
+            </w:r>
+            <w:proofErr w:type="spellEnd"/>
+            <w:r>
+              <w:rPr>
+                <w:rFonts w:cstheme="minorHAnsi"/>
+                <w:sz w:val="16"/>
+                <w:szCs w:val="16"/>
+                <w:lang w:val="en-GB" w:bidi="bn-IN"/>
+              </w:rPr>
+              <w:t xml:space="preserve"> </w:t>
             </w:r>
             <w:r>
               <w:rPr>
@@ -2893,6 +3048,7 @@
               </w:rPr>
               <w:t>08/</w:t>
             </w:r>
+            <w:proofErr w:type="gramStart"/>
             <w:r>
               <w:rPr>
                 <w:rFonts w:cstheme="minorHAnsi"/>
@@ -2905,6 +3061,7 @@
               </w:rPr>
               <w:t>2017 – 03</w:t>
             </w:r>
+            <w:proofErr w:type="gramEnd"/>
             <w:r>
               <w:rPr>
                 <w:rFonts w:cstheme="minorHAnsi"/>
@@ -3183,20 +3340,31 @@
                 <w:szCs w:val="18"/>
                 <w:lang w:val="en-GB" w:bidi="bn-IN"/>
               </w:rPr>
-              <w:t>Tieto and Smilehouse</w:t>
-            </w:r>
-          </w:p>
-        </w:tc>
-        <w:tc>
-          <w:tcPr>
-            <w:tcW w:w="5225" w:type="dxa"/>
-          </w:tcPr>
-          <w:p>
-            <w:pPr>
+              <w:t xml:space="preserve">Tieto and </w:t>
+            </w:r>
+            <w:proofErr w:type="spellStart"/>
+            <w:r>
               <w:rPr>
                 <w:rFonts w:cstheme="minorHAnsi"/>
                 <w:sz w:val="18"/>
                 <w:szCs w:val="18"/>
+                <w:lang w:val="en-GB" w:bidi="bn-IN"/>
+              </w:rPr>
+              <w:t>Smilehouse</w:t>
+            </w:r>
+            <w:proofErr w:type="spellEnd"/>
+          </w:p>
+        </w:tc>
+        <w:tc>
+          <w:tcPr>
+            <w:tcW w:w="5225" w:type="dxa"/>
+          </w:tcPr>
+          <w:p>
+            <w:pPr>
+              <w:rPr>
+                <w:rFonts w:cstheme="minorHAnsi"/>
+                <w:sz w:val="18"/>
+                <w:szCs w:val="18"/>
               </w:rPr>
             </w:pPr>
           </w:p>
@@ -3227,7 +3395,33 @@
                 <w:szCs w:val="16"/>
                 <w:lang w:val="fi-FI"/>
               </w:rPr>
-              <w:t>01/2015 – 07/2017</w:t>
+              <w:t>01/</w:t>
+            </w:r>
+            <w:proofErr w:type="gramStart"/>
+            <w:r>
+              <w:rPr>
+                <w:rFonts w:cstheme="minorHAnsi"/>
+                <w:i/>
+                <w:iCs/>
+                <w:color w:val="808080" w:themeColor="background1" w:themeShade="80"/>
+                <w:sz w:val="16"/>
+                <w:szCs w:val="16"/>
+                <w:lang w:val="fi-FI"/>
+              </w:rPr>
+              <w:t>2015 – 07</w:t>
+            </w:r>
+            <w:proofErr w:type="gramEnd"/>
+            <w:r>
+              <w:rPr>
+                <w:rFonts w:cstheme="minorHAnsi"/>
+                <w:i/>
+                <w:iCs/>
+                <w:color w:val="808080" w:themeColor="background1" w:themeShade="80"/>
+                <w:sz w:val="16"/>
+                <w:szCs w:val="16"/>
+                <w:lang w:val="fi-FI"/>
+              </w:rPr>
+              <w:t>/2017</w:t>
             </w:r>
           </w:p>
         </w:tc>
@@ -3472,6 +3666,7 @@
                 <w:lang w:val="fi-FI"/>
               </w:rPr>
             </w:pPr>
+            <w:proofErr w:type="spellStart"/>
             <w:r>
               <w:rPr>
                 <w:rFonts w:cstheme="minorHAnsi"/>
@@ -3479,20 +3674,30 @@
                 <w:szCs w:val="18"/>
                 <w:lang w:val="en-GB" w:bidi="bn-IN"/>
               </w:rPr>
-              <w:t>Viope Solutions Ltd</w:t>
-            </w:r>
-          </w:p>
-        </w:tc>
-        <w:tc>
-          <w:tcPr>
-            <w:tcW w:w="4849" w:type="dxa"/>
-          </w:tcPr>
-          <w:p>
-            <w:pPr>
+              <w:t>Viope</w:t>
+            </w:r>
+            <w:proofErr w:type="spellEnd"/>
+            <w:r>
               <w:rPr>
                 <w:rFonts w:cstheme="minorHAnsi"/>
                 <w:sz w:val="18"/>
                 <w:szCs w:val="18"/>
+                <w:lang w:val="en-GB" w:bidi="bn-IN"/>
+              </w:rPr>
+              <w:t xml:space="preserve"> Solutions Ltd</w:t>
+            </w:r>
+          </w:p>
+        </w:tc>
+        <w:tc>
+          <w:tcPr>
+            <w:tcW w:w="4849" w:type="dxa"/>
+          </w:tcPr>
+          <w:p>
+            <w:pPr>
+              <w:rPr>
+                <w:rFonts w:cstheme="minorHAnsi"/>
+                <w:sz w:val="18"/>
+                <w:szCs w:val="18"/>
               </w:rPr>
             </w:pPr>
           </w:p>
@@ -3523,7 +3728,33 @@
                 <w:szCs w:val="16"/>
                 <w:lang w:val="fi-FI"/>
               </w:rPr>
-              <w:t>02/2013 – 12/2014</w:t>
+              <w:t>02/</w:t>
+            </w:r>
+            <w:proofErr w:type="gramStart"/>
+            <w:r>
+              <w:rPr>
+                <w:rFonts w:cstheme="minorHAnsi"/>
+                <w:i/>
+                <w:iCs/>
+                <w:color w:val="808080" w:themeColor="background1" w:themeShade="80"/>
+                <w:sz w:val="16"/>
+                <w:szCs w:val="16"/>
+                <w:lang w:val="fi-FI"/>
+              </w:rPr>
+              <w:t>2013 – 12</w:t>
+            </w:r>
+            <w:proofErr w:type="gramEnd"/>
+            <w:r>
+              <w:rPr>
+                <w:rFonts w:cstheme="minorHAnsi"/>
+                <w:i/>
+                <w:iCs/>
+                <w:color w:val="808080" w:themeColor="background1" w:themeShade="80"/>
+                <w:sz w:val="16"/>
+                <w:szCs w:val="16"/>
+                <w:lang w:val="fi-FI"/>
+              </w:rPr>
+              <w:t>/2014</w:t>
             </w:r>
           </w:p>
         </w:tc>
@@ -3842,7 +4073,20 @@
                 <w:szCs w:val="16"/>
                 <w:lang w:val="fi-FI"/>
               </w:rPr>
-              <w:t>/20</w:t>
+              <w:t>/</w:t>
+            </w:r>
+            <w:proofErr w:type="gramStart"/>
+            <w:r>
+              <w:rPr>
+                <w:rFonts w:cstheme="minorHAnsi"/>
+                <w:i/>
+                <w:iCs/>
+                <w:color w:val="808080" w:themeColor="background1" w:themeShade="80"/>
+                <w:sz w:val="16"/>
+                <w:szCs w:val="16"/>
+                <w:lang w:val="fi-FI"/>
+              </w:rPr>
+              <w:t>20</w:t>
             </w:r>
             <w:r>
               <w:rPr>
@@ -3866,7 +4110,20 @@
                 <w:szCs w:val="16"/>
                 <w:lang w:val="fi-FI"/>
               </w:rPr>
-              <w:t xml:space="preserve"> – 07/2011</w:t>
+              <w:t xml:space="preserve"> – 07</w:t>
+            </w:r>
+            <w:proofErr w:type="gramEnd"/>
+            <w:r>
+              <w:rPr>
+                <w:rFonts w:cstheme="minorHAnsi"/>
+                <w:i/>
+                <w:iCs/>
+                <w:color w:val="808080" w:themeColor="background1" w:themeShade="80"/>
+                <w:sz w:val="16"/>
+                <w:szCs w:val="16"/>
+                <w:lang w:val="fi-FI"/>
+              </w:rPr>
+              <w:t>/2011</w:t>
             </w:r>
           </w:p>
         </w:tc>
@@ -4017,6 +4274,14 @@
       <w:tblPr>
         <w:tblStyle w:val="TableGrid"/>
         <w:tblW w:w="0" w:type="auto"/>
+        <w:tblBorders>
+          <w:top w:val="none" w:sz="0" w:space="0" w:color="auto"/>
+          <w:left w:val="none" w:sz="0" w:space="0" w:color="auto"/>
+          <w:bottom w:val="none" w:sz="0" w:space="0" w:color="auto"/>
+          <w:right w:val="none" w:sz="0" w:space="0" w:color="auto"/>
+          <w:insideH w:val="none" w:sz="0" w:space="0" w:color="auto"/>
+          <w:insideV w:val="none" w:sz="0" w:space="0" w:color="auto"/>
+        </w:tblBorders>
         <w:tblLook w:val="04A0" w:firstRow="1" w:lastRow="0" w:firstColumn="1" w:lastColumn="0" w:noHBand="0" w:noVBand="1"/>
       </w:tblPr>
       <w:tblGrid>
@@ -4282,7 +4547,29 @@
                 <w:szCs w:val="16"/>
                 <w:lang w:val="en-GB" w:bidi="bn-IN"/>
               </w:rPr>
-              <w:t>landscaping, as-is to target architecture, finding solutions based on usecases and future expectations</w:t>
+              <w:t xml:space="preserve">landscaping, as-is to target architecture, finding solutions based on </w:t>
+            </w:r>
+            <w:proofErr w:type="spellStart"/>
+            <w:r>
+              <w:rPr>
+                <w:rFonts w:cstheme="minorHAnsi"/>
+                <w:color w:val="7F7F7F" w:themeColor="text1" w:themeTint="80"/>
+                <w:sz w:val="16"/>
+                <w:szCs w:val="16"/>
+                <w:lang w:val="en-GB" w:bidi="bn-IN"/>
+              </w:rPr>
+              <w:t>usecases</w:t>
+            </w:r>
+            <w:proofErr w:type="spellEnd"/>
+            <w:r>
+              <w:rPr>
+                <w:rFonts w:cstheme="minorHAnsi"/>
+                <w:color w:val="7F7F7F" w:themeColor="text1" w:themeTint="80"/>
+                <w:sz w:val="16"/>
+                <w:szCs w:val="16"/>
+                <w:lang w:val="en-GB" w:bidi="bn-IN"/>
+              </w:rPr>
+              <w:t xml:space="preserve"> and future expectations</w:t>
             </w:r>
           </w:p>
         </w:tc>
@@ -4824,7 +5111,33 @@
                 <w:szCs w:val="16"/>
                 <w:lang w:val="fi-FI"/>
               </w:rPr>
-              <w:t>08/2017 – 03/2020</w:t>
+              <w:t>08/</w:t>
+            </w:r>
+            <w:proofErr w:type="gramStart"/>
+            <w:r>
+              <w:rPr>
+                <w:rFonts w:cstheme="minorHAnsi"/>
+                <w:i/>
+                <w:iCs/>
+                <w:color w:val="808080" w:themeColor="background1" w:themeShade="80"/>
+                <w:sz w:val="16"/>
+                <w:szCs w:val="16"/>
+                <w:lang w:val="fi-FI"/>
+              </w:rPr>
+              <w:t>2017 – 03</w:t>
+            </w:r>
+            <w:proofErr w:type="gramEnd"/>
+            <w:r>
+              <w:rPr>
+                <w:rFonts w:cstheme="minorHAnsi"/>
+                <w:i/>
+                <w:iCs/>
+                <w:color w:val="808080" w:themeColor="background1" w:themeShade="80"/>
+                <w:sz w:val="16"/>
+                <w:szCs w:val="16"/>
+                <w:lang w:val="fi-FI"/>
+              </w:rPr>
+              <w:t>/2020</w:t>
             </w:r>
           </w:p>
         </w:tc>
@@ -4854,8 +5167,22 @@
                 <w:szCs w:val="16"/>
                 <w:lang w:val="fi-FI"/>
               </w:rPr>
-              <w:t>Helsinki, FInland</w:t>
-            </w:r>
+              <w:t xml:space="preserve">Helsinki, </w:t>
+            </w:r>
+            <w:proofErr w:type="spellStart"/>
+            <w:r>
+              <w:rPr>
+                <w:rFonts w:cstheme="minorHAnsi"/>
+                <w:i/>
+                <w:iCs/>
+                <w:color w:val="808080" w:themeColor="background1" w:themeShade="80"/>
+                <w:sz w:val="16"/>
+                <w:szCs w:val="16"/>
+                <w:lang w:val="fi-FI"/>
+              </w:rPr>
+              <w:t>FInland</w:t>
+            </w:r>
+            <w:proofErr w:type="spellEnd"/>
           </w:p>
         </w:tc>
         <w:tc>
@@ -4884,7 +5211,33 @@
                 <w:szCs w:val="16"/>
                 <w:lang w:val="fi-FI"/>
               </w:rPr>
-              <w:t>05/2016 – 07/2017</w:t>
+              <w:t>05/</w:t>
+            </w:r>
+            <w:proofErr w:type="gramStart"/>
+            <w:r>
+              <w:rPr>
+                <w:rFonts w:cstheme="minorHAnsi"/>
+                <w:i/>
+                <w:iCs/>
+                <w:color w:val="808080" w:themeColor="background1" w:themeShade="80"/>
+                <w:sz w:val="16"/>
+                <w:szCs w:val="16"/>
+                <w:lang w:val="fi-FI"/>
+              </w:rPr>
+              <w:t>2016 – 07</w:t>
+            </w:r>
+            <w:proofErr w:type="gramEnd"/>
+            <w:r>
+              <w:rPr>
+                <w:rFonts w:cstheme="minorHAnsi"/>
+                <w:i/>
+                <w:iCs/>
+                <w:color w:val="808080" w:themeColor="background1" w:themeShade="80"/>
+                <w:sz w:val="16"/>
+                <w:szCs w:val="16"/>
+                <w:lang w:val="fi-FI"/>
+              </w:rPr>
+              <w:t>/2017</w:t>
             </w:r>
           </w:p>
         </w:tc>
@@ -5084,6 +5437,7 @@
                 <w:lang w:val="fi-FI"/>
               </w:rPr>
             </w:pPr>
+            <w:proofErr w:type="spellStart"/>
             <w:r>
               <w:rPr>
                 <w:rFonts w:cstheme="minorHAnsi"/>
@@ -5096,6 +5450,7 @@
               </w:rPr>
               <w:t>Corsearch</w:t>
             </w:r>
+            <w:proofErr w:type="spellEnd"/>
           </w:p>
         </w:tc>
         <w:tc>
@@ -5181,17 +5536,31 @@
                 <w:lang w:val="fi-FI"/>
               </w:rPr>
             </w:pPr>
-            <w:r>
-              <w:rPr>
-                <w:rFonts w:cstheme="minorHAnsi"/>
-                <w:i/>
-                <w:iCs/>
-                <w:color w:val="808080" w:themeColor="background1" w:themeShade="80"/>
-                <w:sz w:val="16"/>
-                <w:szCs w:val="16"/>
-                <w:lang w:val="fi-FI"/>
-              </w:rPr>
-              <w:t xml:space="preserve">Corsearch </w:t>
+            <w:proofErr w:type="spellStart"/>
+            <w:r>
+              <w:rPr>
+                <w:rFonts w:cstheme="minorHAnsi"/>
+                <w:i/>
+                <w:iCs/>
+                <w:color w:val="808080" w:themeColor="background1" w:themeShade="80"/>
+                <w:sz w:val="16"/>
+                <w:szCs w:val="16"/>
+                <w:lang w:val="fi-FI"/>
+              </w:rPr>
+              <w:t>Corsearch</w:t>
+            </w:r>
+            <w:proofErr w:type="spellEnd"/>
+            <w:r>
+              <w:rPr>
+                <w:rFonts w:cstheme="minorHAnsi"/>
+                <w:i/>
+                <w:iCs/>
+                <w:color w:val="808080" w:themeColor="background1" w:themeShade="80"/>
+                <w:sz w:val="16"/>
+                <w:szCs w:val="16"/>
+                <w:lang w:val="fi-FI"/>
+              </w:rPr>
+              <w:t xml:space="preserve"> </w:t>
             </w:r>
           </w:p>
         </w:tc>
@@ -5328,7 +5697,6 @@
                 <w:szCs w:val="16"/>
                 <w:lang w:val="fi-FI"/>
               </w:rPr>
-              <w:lastRenderedPageBreak/>
               <w:t>Accenture</w:t>
             </w:r>
           </w:p>
@@ -5410,6 +5778,7 @@
                 <w:lang w:val="fi-FI"/>
               </w:rPr>
             </w:pPr>
+            <w:proofErr w:type="gramStart"/>
             <w:r>
               <w:rPr>
                 <w:rFonts w:cstheme="minorHAnsi"/>
@@ -5444,7 +5813,20 @@
                 <w:szCs w:val="16"/>
                 <w:lang w:val="fi-FI"/>
               </w:rPr>
-              <w:t>12/2019</w:t>
+              <w:t>12</w:t>
+            </w:r>
+            <w:proofErr w:type="gramEnd"/>
+            <w:r>
+              <w:rPr>
+                <w:rFonts w:cstheme="minorHAnsi"/>
+                <w:i/>
+                <w:iCs/>
+                <w:color w:val="808080" w:themeColor="background1" w:themeShade="80"/>
+                <w:sz w:val="16"/>
+                <w:szCs w:val="16"/>
+                <w:lang w:val="fi-FI"/>
+              </w:rPr>
+              <w:t>/2019</w:t>
             </w:r>
           </w:p>
         </w:tc>
@@ -5470,6 +5852,7 @@
                 <w:szCs w:val="18"/>
                 <w:lang w:val="en-GB" w:bidi="bn-IN"/>
               </w:rPr>
+              <w:lastRenderedPageBreak/>
               <w:t>SAP Commerce Cloud (Hybris 6.x)</w:t>
             </w:r>
           </w:p>
@@ -5578,6 +5961,7 @@
                 <w:lang w:val="fi-FI"/>
               </w:rPr>
             </w:pPr>
+            <w:proofErr w:type="spellStart"/>
             <w:r>
               <w:rPr>
                 <w:rFonts w:cstheme="minorHAnsi"/>
@@ -5590,6 +5974,7 @@
               </w:rPr>
               <w:t>Smilehouse</w:t>
             </w:r>
+            <w:proofErr w:type="spellEnd"/>
           </w:p>
         </w:tc>
         <w:tc>
@@ -5763,18 +6148,46 @@
                 <w:lang w:val="fi-FI"/>
               </w:rPr>
             </w:pPr>
-            <w:r>
-              <w:rPr>
-                <w:rFonts w:cstheme="minorHAnsi"/>
-                <w:i/>
-                <w:iCs/>
-                <w:color w:val="808080" w:themeColor="background1" w:themeShade="80"/>
-                <w:sz w:val="16"/>
-                <w:szCs w:val="16"/>
-                <w:lang w:val="fi-FI"/>
-              </w:rPr>
-              <w:t>University of California</w:t>
-            </w:r>
+            <w:proofErr w:type="spellStart"/>
+            <w:r>
+              <w:rPr>
+                <w:rFonts w:cstheme="minorHAnsi"/>
+                <w:i/>
+                <w:iCs/>
+                <w:color w:val="808080" w:themeColor="background1" w:themeShade="80"/>
+                <w:sz w:val="16"/>
+                <w:szCs w:val="16"/>
+                <w:lang w:val="fi-FI"/>
+              </w:rPr>
+              <w:t>University</w:t>
+            </w:r>
+            <w:proofErr w:type="spellEnd"/>
+            <w:r>
+              <w:rPr>
+                <w:rFonts w:cstheme="minorHAnsi"/>
+                <w:i/>
+                <w:iCs/>
+                <w:color w:val="808080" w:themeColor="background1" w:themeShade="80"/>
+                <w:sz w:val="16"/>
+                <w:szCs w:val="16"/>
+                <w:lang w:val="fi-FI"/>
+              </w:rPr>
+              <w:t xml:space="preserve"> of </w:t>
+            </w:r>
+            <w:proofErr w:type="spellStart"/>
+            <w:r>
+              <w:rPr>
+                <w:rFonts w:cstheme="minorHAnsi"/>
+                <w:i/>
+                <w:iCs/>
+                <w:color w:val="808080" w:themeColor="background1" w:themeShade="80"/>
+                <w:sz w:val="16"/>
+                <w:szCs w:val="16"/>
+                <w:lang w:val="fi-FI"/>
+              </w:rPr>
+              <w:t>California</w:t>
+            </w:r>
+            <w:proofErr w:type="spellEnd"/>
           </w:p>
         </w:tc>
         <w:tc>
@@ -6000,8 +6413,20 @@
                 <w:szCs w:val="16"/>
                 <w:lang w:val="en-GB" w:bidi="bn-IN"/>
               </w:rPr>
-              <w:t>Technology used: Nordea API, IBM-Blumix</w:t>
-            </w:r>
+              <w:t>Technology used: Nordea API, IBM-</w:t>
+            </w:r>
+            <w:proofErr w:type="spellStart"/>
+            <w:r>
+              <w:rPr>
+                <w:rFonts w:cstheme="minorHAnsi"/>
+                <w:color w:val="000000"/>
+                <w:sz w:val="16"/>
+                <w:szCs w:val="16"/>
+                <w:lang w:val="en-GB" w:bidi="bn-IN"/>
+              </w:rPr>
+              <w:t>Blumix</w:t>
+            </w:r>
+            <w:proofErr w:type="spellEnd"/>
           </w:p>
         </w:tc>
       </w:tr>
@@ -6262,17 +6687,31 @@
                 <w:lang w:val="fi-FI"/>
               </w:rPr>
             </w:pPr>
-            <w:r>
-              <w:rPr>
-                <w:rFonts w:cstheme="minorHAnsi"/>
-                <w:i/>
-                <w:iCs/>
-                <w:color w:val="808080" w:themeColor="background1" w:themeShade="80"/>
-                <w:sz w:val="16"/>
-                <w:szCs w:val="16"/>
-                <w:lang w:val="fi-FI"/>
-              </w:rPr>
-              <w:t>University of Helsinki</w:t>
+            <w:proofErr w:type="spellStart"/>
+            <w:r>
+              <w:rPr>
+                <w:rFonts w:cstheme="minorHAnsi"/>
+                <w:i/>
+                <w:iCs/>
+                <w:color w:val="808080" w:themeColor="background1" w:themeShade="80"/>
+                <w:sz w:val="16"/>
+                <w:szCs w:val="16"/>
+                <w:lang w:val="fi-FI"/>
+              </w:rPr>
+              <w:t>University</w:t>
+            </w:r>
+            <w:proofErr w:type="spellEnd"/>
+            <w:r>
+              <w:rPr>
+                <w:rFonts w:cstheme="minorHAnsi"/>
+                <w:i/>
+                <w:iCs/>
+                <w:color w:val="808080" w:themeColor="background1" w:themeShade="80"/>
+                <w:sz w:val="16"/>
+                <w:szCs w:val="16"/>
+                <w:lang w:val="fi-FI"/>
+              </w:rPr>
+              <w:t xml:space="preserve"> of Helsinki</w:t>
             </w:r>
           </w:p>
         </w:tc>
@@ -6395,8 +6834,22 @@
                 <w:szCs w:val="16"/>
                 <w:lang w:val="fi-FI"/>
               </w:rPr>
-              <w:t>BRAC University</w:t>
-            </w:r>
+              <w:t xml:space="preserve">BRAC </w:t>
+            </w:r>
+            <w:proofErr w:type="spellStart"/>
+            <w:r>
+              <w:rPr>
+                <w:rFonts w:cstheme="minorHAnsi"/>
+                <w:i/>
+                <w:iCs/>
+                <w:color w:val="808080" w:themeColor="background1" w:themeShade="80"/>
+                <w:sz w:val="16"/>
+                <w:szCs w:val="16"/>
+                <w:lang w:val="fi-FI"/>
+              </w:rPr>
+              <w:t>University</w:t>
+            </w:r>
+            <w:proofErr w:type="spellEnd"/>
           </w:p>
         </w:tc>
         <w:tc>
@@ -6507,7 +6960,31 @@
                 <w:szCs w:val="18"/>
                 <w:lang w:val="en-GB" w:bidi="bn-IN"/>
               </w:rPr>
-              <w:t>Minimally Segmenting High Performance Bangla Optical Character Recognition Using Kohonen Network</w:t>
+              <w:t xml:space="preserve">Minimally Segmenting </w:t>
+            </w:r>
+            <w:proofErr w:type="gramStart"/>
+            <w:r>
+              <w:rPr>
+                <w:rFonts w:cstheme="minorHAnsi"/>
+                <w:b/>
+                <w:bCs/>
+                <w:sz w:val="18"/>
+                <w:szCs w:val="18"/>
+                <w:lang w:val="en-GB" w:bidi="bn-IN"/>
+              </w:rPr>
+              <w:t>High Performance</w:t>
+            </w:r>
+            <w:proofErr w:type="gramEnd"/>
+            <w:r>
+              <w:rPr>
+                <w:rFonts w:cstheme="minorHAnsi"/>
+                <w:b/>
+                <w:bCs/>
+                <w:sz w:val="18"/>
+                <w:szCs w:val="18"/>
+                <w:lang w:val="en-GB" w:bidi="bn-IN"/>
+              </w:rPr>
+              <w:t xml:space="preserve"> Bangla Optical Character Recognition Using Kohonen Network</w:t>
             </w:r>
           </w:p>
         </w:tc>
@@ -6618,7 +7095,33 @@
                 <w:szCs w:val="16"/>
                 <w:lang w:val="en-US"/>
               </w:rPr>
-              <w:t>Adnan Md. Shoeb Shatil, Dr. Mumit Khan</w:t>
+              <w:t xml:space="preserve">Adnan Md. Shoeb Shatil, Dr. </w:t>
+            </w:r>
+            <w:proofErr w:type="spellStart"/>
+            <w:r>
+              <w:rPr>
+                <w:rFonts w:cstheme="minorHAnsi"/>
+                <w:i/>
+                <w:iCs/>
+                <w:color w:val="808080" w:themeColor="background1" w:themeShade="80"/>
+                <w:sz w:val="16"/>
+                <w:szCs w:val="16"/>
+                <w:lang w:val="en-US"/>
+              </w:rPr>
+              <w:t>Mumit</w:t>
+            </w:r>
+            <w:proofErr w:type="spellEnd"/>
+            <w:r>
+              <w:rPr>
+                <w:rFonts w:cstheme="minorHAnsi"/>
+                <w:i/>
+                <w:iCs/>
+                <w:color w:val="808080" w:themeColor="background1" w:themeShade="80"/>
+                <w:sz w:val="16"/>
+                <w:szCs w:val="16"/>
+                <w:lang w:val="en-US"/>
+              </w:rPr>
+              <w:t xml:space="preserve"> Khan</w:t>
             </w:r>
           </w:p>
         </w:tc>

</xml_diff>

<commit_message>
Add duplicate role filtering, mandatory Finnish language detection, and purge INTERNAL watermark from CV PDF
</commit_message>
<xml_diff>
--- a/source/AdnanShatilCV.docx
+++ b/source/AdnanShatilCV.docx
@@ -4952,386 +4952,20 @@
 </file>
 
 <file path=word/footer1.xml><?xml version="1.0" encoding="utf-8"?>
-<w:ftr xmlns:wpc="http://schemas.microsoft.com/office/word/2010/wordprocessingCanvas" xmlns:cx="http://schemas.microsoft.com/office/drawing/2014/chartex" xmlns:cx1="http://schemas.microsoft.com/office/drawing/2015/9/8/chartex" xmlns:cx2="http://schemas.microsoft.com/office/drawing/2015/10/21/chartex" xmlns:cx3="http://schemas.microsoft.com/office/drawing/2016/5/9/chartex" xmlns:cx4="http://schemas.microsoft.com/office/drawing/2016/5/10/chartex" xmlns:cx5="http://schemas.microsoft.com/office/drawing/2016/5/11/chartex" xmlns:cx6="http://schemas.microsoft.com/office/drawing/2016/5/12/chartex" xmlns:cx7="http://schemas.microsoft.com/office/drawing/2016/5/13/chartex" xmlns:cx8="http://schemas.microsoft.com/office/drawing/2016/5/14/chartex" xmlns:mc="http://schemas.openxmlformats.org/markup-compatibility/2006" xmlns:m="http://schemas.openxmlformats.org/officeDocument/2006/math" xmlns:aink="http://schemas.microsoft.com/office/drawing/2016/ink" xmlns:am3d="http://schemas.microsoft.com/office/drawing/2017/model3d" xmlns:oel="http://schemas.microsoft.com/office/2019/extlst" xmlns:r="http://schemas.openxmlformats.org/officeDocument/2006/relationships" xmlns:wp14="http://schemas.microsoft.com/office/word/2010/wordprocessingDrawing" xmlns:wp="http://schemas.openxmlformats.org/drawingml/2006/wordprocessingDrawing" xmlns:wpg="http://schemas.microsoft.com/office/word/2010/wordprocessingGroup" xmlns:wpi="http://schemas.microsoft.com/office/word/2010/wordprocessingInk" xmlns:wps="http://schemas.microsoft.com/office/word/2010/wordprocessingShape" xmlns:o="urn:schemas-microsoft-com:office:office" xmlns:v="urn:schemas-microsoft-com:vml" xmlns:w10="urn:schemas-microsoft-com:office:word" xmlns:w="http://schemas.openxmlformats.org/wordprocessingml/2006/main" xmlns:w14="http://schemas.microsoft.com/office/word/2010/wordml" xmlns:w15="http://schemas.microsoft.com/office/word/2012/wordml" xmlns:w16cex="http://schemas.microsoft.com/office/word/2018/wordml/cex" xmlns:w16cid="http://schemas.microsoft.com/office/word/2016/wordml/cid" xmlns:w16="http://schemas.microsoft.com/office/word/2018/wordml" xmlns:w16sdtdh="http://schemas.microsoft.com/office/word/2020/wordml/sdtdatahash" xmlns:w16sdtfl="http://schemas.microsoft.com/office/word/2024/wordml/sdtformatlock" xmlns:w16se="http://schemas.microsoft.com/office/word/2015/wordml/symex" xmlns:w16du="http://schemas.microsoft.com/office/word/2023/wordml/word16du" xmlns:wne="http://schemas.microsoft.com/office/word/2006/wordml" mc:Ignorable="w14 w15 w16se w16cid w16 w16cex w16sdtdh w16sdtfl w16du wp14">
-  <w:p>
-    <w:pPr>
-      <w:pStyle w:val="Footer"/>
-    </w:pPr>
-    <w:r>
-      <w:rPr>
-        <w:noProof/>
-      </w:rPr>
-      <mc:AlternateContent>
-        <mc:Choice Requires="wps">
-          <w:drawing>
-            <wp:anchor distT="0" distB="0" distL="0" distR="0" simplePos="0" relativeHeight="251659264" behindDoc="0" locked="0" layoutInCell="1" allowOverlap="1" wp14:anchorId="3D78BD32" wp14:editId="75D996DC">
-              <wp:simplePos x="635" y="635"/>
-              <wp:positionH relativeFrom="page">
-                <wp:align>left</wp:align>
-              </wp:positionH>
-              <wp:positionV relativeFrom="page">
-                <wp:align>bottom</wp:align>
-              </wp:positionV>
-              <wp:extent cx="813435" cy="345440"/>
-              <wp:effectExtent l="0" t="0" r="12065" b="0"/>
-              <wp:wrapNone/>
-              <wp:docPr id="1132840070" name="Text Box 14" descr="INTERNAL ">
-                <a:extLst xmlns:a="http://schemas.openxmlformats.org/drawingml/2006/main">
-                  <a:ext uri="{5AE41FA2-C0FF-4470-9BD4-5FADCA87CBE2}">
-                    <aclsh:classification xmlns:aclsh="http://schemas.microsoft.com/office/drawing/2020/classificationShape" classificationOutcomeType="ftr"/>
-                  </a:ext>
-                </a:extLst>
-              </wp:docPr>
-              <wp:cNvGraphicFramePr/>
-              <a:graphic xmlns:a="http://schemas.openxmlformats.org/drawingml/2006/main">
-                <a:graphicData uri="http://schemas.microsoft.com/office/word/2010/wordprocessingShape">
-                  <wps:wsp>
-                    <wps:cNvSpPr txBox="1"/>
-                    <wps:spPr>
-                      <a:xfrm>
-                        <a:off x="0" y="0"/>
-                        <a:ext cx="813435" cy="345440"/>
-                      </a:xfrm>
-                      <a:prstGeom prst="rect">
-                        <a:avLst/>
-                      </a:prstGeom>
-                      <a:noFill/>
-                      <a:ln>
-                        <a:noFill/>
-                      </a:ln>
-                    </wps:spPr>
-                    <wps:txbx>
-                      <w:txbxContent>
-                        <w:p>
-                          <w:pPr>
-                            <w:rPr>
-                              <w:rFonts w:ascii="Aptos" w:eastAsia="Aptos" w:hAnsi="Aptos" w:cs="Aptos"/>
-                              <w:noProof/>
-                              <w:color w:val="000000"/>
-                              <w:sz w:val="20"/>
-                              <w:szCs w:val="20"/>
-                            </w:rPr>
-                          </w:pPr>
-                          <w:r>
-                            <w:rPr>
-                              <w:rFonts w:ascii="Aptos" w:eastAsia="Aptos" w:hAnsi="Aptos" w:cs="Aptos"/>
-                              <w:noProof/>
-                              <w:color w:val="000000"/>
-                              <w:sz w:val="20"/>
-                              <w:szCs w:val="20"/>
-                            </w:rPr>
-                            <w:t xml:space="preserve">INTERNAL </w:t>
-                          </w:r>
-                        </w:p>
-                      </w:txbxContent>
-                    </wps:txbx>
-                    <wps:bodyPr rot="0" spcFirstLastPara="0" vertOverflow="overflow" horzOverflow="overflow" vert="horz" wrap="none" lIns="254000" tIns="0" rIns="0" bIns="190500" numCol="1" spcCol="0" rtlCol="0" fromWordArt="0" anchor="b" anchorCtr="0" forceAA="0" compatLnSpc="1">
-                      <a:prstTxWarp prst="textNoShape">
-                        <a:avLst/>
-                      </a:prstTxWarp>
-                      <a:spAutoFit/>
-                    </wps:bodyPr>
-                  </wps:wsp>
-                </a:graphicData>
-              </a:graphic>
-            </wp:anchor>
-          </w:drawing>
-        </mc:Choice>
-        <mc:Fallback>
-          <w:pict>
-            <v:shapetype w14:anchorId="3D78BD32" id="_x0000_t202" coordsize="21600,21600" o:spt="202" path="m,l,21600r21600,l21600,xe">
-              <v:stroke joinstyle="miter"/>
-              <v:path gradientshapeok="t" o:connecttype="rect"/>
-            </v:shapetype>
-            <v:shape id="Text Box 14" o:spid="_x0000_s1026" type="#_x0000_t202" alt="INTERNAL " style="position:absolute;margin-left:0;margin-top:0;width:64.05pt;height:27.2pt;z-index:251659264;visibility:visible;mso-wrap-style:none;mso-wrap-distance-left:0;mso-wrap-distance-top:0;mso-wrap-distance-right:0;mso-wrap-distance-bottom:0;mso-position-horizontal:left;mso-position-horizontal-relative:page;mso-position-vertical:bottom;mso-position-vertical-relative:page;v-text-anchor:bottom" o:gfxdata="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" filled="f" stroked="f">
-              <v:textbox style="mso-fit-shape-to-text:t" inset="20pt,0,0,15pt">
-                <w:txbxContent>
-                  <w:p>
-                    <w:pPr>
-                      <w:rPr>
-                        <w:rFonts w:ascii="Aptos" w:eastAsia="Aptos" w:hAnsi="Aptos" w:cs="Aptos"/>
-                        <w:noProof/>
-                        <w:color w:val="000000"/>
-                        <w:sz w:val="20"/>
-                        <w:szCs w:val="20"/>
-                      </w:rPr>
-                    </w:pPr>
-                    <w:r>
-                      <w:rPr>
-                        <w:rFonts w:ascii="Aptos" w:eastAsia="Aptos" w:hAnsi="Aptos" w:cs="Aptos"/>
-                        <w:noProof/>
-                        <w:color w:val="000000"/>
-                        <w:sz w:val="20"/>
-                        <w:szCs w:val="20"/>
-                      </w:rPr>
-                      <w:t xml:space="preserve">INTERNAL </w:t>
-                    </w:r>
-                  </w:p>
-                </w:txbxContent>
-              </v:textbox>
-              <w10:wrap anchorx="page" anchory="page"/>
-            </v:shape>
-          </w:pict>
-        </mc:Fallback>
-      </mc:AlternateContent>
-    </w:r>
-  </w:p>
+<w:ftr xmlns:w="http://schemas.openxmlformats.org/wordprocessingml/2006/main">
+  <w:p/>
 </w:ftr>
 </file>
 
 <file path=word/footer2.xml><?xml version="1.0" encoding="utf-8"?>
-<w:ftr xmlns:wpc="http://schemas.microsoft.com/office/word/2010/wordprocessingCanvas" xmlns:cx="http://schemas.microsoft.com/office/drawing/2014/chartex" xmlns:cx1="http://schemas.microsoft.com/office/drawing/2015/9/8/chartex" xmlns:cx2="http://schemas.microsoft.com/office/drawing/2015/10/21/chartex" xmlns:cx3="http://schemas.microsoft.com/office/drawing/2016/5/9/chartex" xmlns:cx4="http://schemas.microsoft.com/office/drawing/2016/5/10/chartex" xmlns:cx5="http://schemas.microsoft.com/office/drawing/2016/5/11/chartex" xmlns:cx6="http://schemas.microsoft.com/office/drawing/2016/5/12/chartex" xmlns:cx7="http://schemas.microsoft.com/office/drawing/2016/5/13/chartex" xmlns:cx8="http://schemas.microsoft.com/office/drawing/2016/5/14/chartex" xmlns:mc="http://schemas.openxmlformats.org/markup-compatibility/2006" xmlns:m="http://schemas.openxmlformats.org/officeDocument/2006/math" xmlns:aink="http://schemas.microsoft.com/office/drawing/2016/ink" xmlns:am3d="http://schemas.microsoft.com/office/drawing/2017/model3d" xmlns:oel="http://schemas.microsoft.com/office/2019/extlst" xmlns:r="http://schemas.openxmlformats.org/officeDocument/2006/relationships" xmlns:wp14="http://schemas.microsoft.com/office/word/2010/wordprocessingDrawing" xmlns:wp="http://schemas.openxmlformats.org/drawingml/2006/wordprocessingDrawing" xmlns:wpg="http://schemas.microsoft.com/office/word/2010/wordprocessingGroup" xmlns:wpi="http://schemas.microsoft.com/office/word/2010/wordprocessingInk" xmlns:wps="http://schemas.microsoft.com/office/word/2010/wordprocessingShape" xmlns:o="urn:schemas-microsoft-com:office:office" xmlns:v="urn:schemas-microsoft-com:vml" xmlns:w10="urn:schemas-microsoft-com:office:word" xmlns:w="http://schemas.openxmlformats.org/wordprocessingml/2006/main" xmlns:w14="http://schemas.microsoft.com/office/word/2010/wordml" xmlns:w15="http://schemas.microsoft.com/office/word/2012/wordml" xmlns:w16cex="http://schemas.microsoft.com/office/word/2018/wordml/cex" xmlns:w16cid="http://schemas.microsoft.com/office/word/2016/wordml/cid" xmlns:w16="http://schemas.microsoft.com/office/word/2018/wordml" xmlns:w16sdtdh="http://schemas.microsoft.com/office/word/2020/wordml/sdtdatahash" xmlns:w16sdtfl="http://schemas.microsoft.com/office/word/2024/wordml/sdtformatlock" xmlns:w16se="http://schemas.microsoft.com/office/word/2015/wordml/symex" xmlns:w16du="http://schemas.microsoft.com/office/word/2023/wordml/word16du" xmlns:wne="http://schemas.microsoft.com/office/word/2006/wordml" mc:Ignorable="w14 w15 w16se w16cid w16 w16cex w16sdtdh w16sdtfl w16du wp14">
-  <w:p>
-    <w:pPr>
-      <w:pStyle w:val="Footer"/>
-    </w:pPr>
-    <w:r>
-      <w:rPr>
-        <w:noProof/>
-      </w:rPr>
-      <mc:AlternateContent>
-        <mc:Choice Requires="wps">
-          <w:drawing>
-            <wp:anchor distT="0" distB="0" distL="0" distR="0" simplePos="0" relativeHeight="251660288" behindDoc="0" locked="0" layoutInCell="1" allowOverlap="1" wp14:anchorId="4BB02762" wp14:editId="36357A67">
-              <wp:simplePos x="0" y="0"/>
-              <wp:positionH relativeFrom="page">
-                <wp:align>left</wp:align>
-              </wp:positionH>
-              <wp:positionV relativeFrom="page">
-                <wp:align>bottom</wp:align>
-              </wp:positionV>
-              <wp:extent cx="813435" cy="345440"/>
-              <wp:effectExtent l="0" t="0" r="12065" b="0"/>
-              <wp:wrapNone/>
-              <wp:docPr id="1367144938" name="Text Box 15" descr="INTERNAL ">
-                <a:extLst xmlns:a="http://schemas.openxmlformats.org/drawingml/2006/main">
-                  <a:ext uri="{5AE41FA2-C0FF-4470-9BD4-5FADCA87CBE2}">
-                    <aclsh:classification xmlns:aclsh="http://schemas.microsoft.com/office/drawing/2020/classificationShape" classificationOutcomeType="ftr"/>
-                  </a:ext>
-                </a:extLst>
-              </wp:docPr>
-              <wp:cNvGraphicFramePr/>
-              <a:graphic xmlns:a="http://schemas.openxmlformats.org/drawingml/2006/main">
-                <a:graphicData uri="http://schemas.microsoft.com/office/word/2010/wordprocessingShape">
-                  <wps:wsp>
-                    <wps:cNvSpPr txBox="1"/>
-                    <wps:spPr>
-                      <a:xfrm>
-                        <a:off x="0" y="0"/>
-                        <a:ext cx="813435" cy="345440"/>
-                      </a:xfrm>
-                      <a:prstGeom prst="rect">
-                        <a:avLst/>
-                      </a:prstGeom>
-                      <a:noFill/>
-                      <a:ln>
-                        <a:noFill/>
-                      </a:ln>
-                    </wps:spPr>
-                    <wps:txbx>
-                      <w:txbxContent>
-                        <w:p>
-                          <w:pPr>
-                            <w:rPr>
-                              <w:rFonts w:ascii="Aptos" w:eastAsia="Aptos" w:hAnsi="Aptos" w:cs="Aptos"/>
-                              <w:noProof/>
-                              <w:color w:val="000000"/>
-                              <w:sz w:val="20"/>
-                              <w:szCs w:val="20"/>
-                            </w:rPr>
-                          </w:pPr>
-                          <w:r>
-                            <w:rPr>
-                              <w:rFonts w:ascii="Aptos" w:eastAsia="Aptos" w:hAnsi="Aptos" w:cs="Aptos"/>
-                              <w:noProof/>
-                              <w:color w:val="000000"/>
-                              <w:sz w:val="20"/>
-                              <w:szCs w:val="20"/>
-                            </w:rPr>
-                            <w:t xml:space="preserve">INTERNAL </w:t>
-                          </w:r>
-                        </w:p>
-                      </w:txbxContent>
-                    </wps:txbx>
-                    <wps:bodyPr rot="0" spcFirstLastPara="0" vertOverflow="overflow" horzOverflow="overflow" vert="horz" wrap="none" lIns="254000" tIns="0" rIns="0" bIns="190500" numCol="1" spcCol="0" rtlCol="0" fromWordArt="0" anchor="b" anchorCtr="0" forceAA="0" compatLnSpc="1">
-                      <a:prstTxWarp prst="textNoShape">
-                        <a:avLst/>
-                      </a:prstTxWarp>
-                      <a:spAutoFit/>
-                    </wps:bodyPr>
-                  </wps:wsp>
-                </a:graphicData>
-              </a:graphic>
-            </wp:anchor>
-          </w:drawing>
-        </mc:Choice>
-        <mc:Fallback>
-          <w:pict>
-            <v:shapetype w14:anchorId="4BB02762" id="_x0000_t202" coordsize="21600,21600" o:spt="202" path="m,l,21600r21600,l21600,xe">
-              <v:stroke joinstyle="miter"/>
-              <v:path gradientshapeok="t" o:connecttype="rect"/>
-            </v:shapetype>
-            <v:shape id="Text Box 15" o:spid="_x0000_s1027" type="#_x0000_t202" alt="INTERNAL " style="position:absolute;margin-left:0;margin-top:0;width:64.05pt;height:27.2pt;z-index:251660288;visibility:visible;mso-wrap-style:none;mso-wrap-distance-left:0;mso-wrap-distance-top:0;mso-wrap-distance-right:0;mso-wrap-distance-bottom:0;mso-position-horizontal:left;mso-position-horizontal-relative:page;mso-position-vertical:bottom;mso-position-vertical-relative:page;v-text-anchor:bottom" o:gfxdata="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" filled="f" stroked="f">
-              <v:textbox style="mso-fit-shape-to-text:t" inset="20pt,0,0,15pt">
-                <w:txbxContent>
-                  <w:p>
-                    <w:pPr>
-                      <w:rPr>
-                        <w:rFonts w:ascii="Aptos" w:eastAsia="Aptos" w:hAnsi="Aptos" w:cs="Aptos"/>
-                        <w:noProof/>
-                        <w:color w:val="000000"/>
-                        <w:sz w:val="20"/>
-                        <w:szCs w:val="20"/>
-                      </w:rPr>
-                    </w:pPr>
-                    <w:r>
-                      <w:rPr>
-                        <w:rFonts w:ascii="Aptos" w:eastAsia="Aptos" w:hAnsi="Aptos" w:cs="Aptos"/>
-                        <w:noProof/>
-                        <w:color w:val="000000"/>
-                        <w:sz w:val="20"/>
-                        <w:szCs w:val="20"/>
-                      </w:rPr>
-                      <w:t xml:space="preserve">INTERNAL </w:t>
-                    </w:r>
-                  </w:p>
-                </w:txbxContent>
-              </v:textbox>
-              <w10:wrap anchorx="page" anchory="page"/>
-            </v:shape>
-          </w:pict>
-        </mc:Fallback>
-      </mc:AlternateContent>
-    </w:r>
-  </w:p>
+<w:ftr xmlns:w="http://schemas.openxmlformats.org/wordprocessingml/2006/main">
+  <w:p/>
 </w:ftr>
 </file>
 
 <file path=word/footer3.xml><?xml version="1.0" encoding="utf-8"?>
-<w:ftr xmlns:wpc="http://schemas.microsoft.com/office/word/2010/wordprocessingCanvas" xmlns:cx="http://schemas.microsoft.com/office/drawing/2014/chartex" xmlns:cx1="http://schemas.microsoft.com/office/drawing/2015/9/8/chartex" xmlns:cx2="http://schemas.microsoft.com/office/drawing/2015/10/21/chartex" xmlns:cx3="http://schemas.microsoft.com/office/drawing/2016/5/9/chartex" xmlns:cx4="http://schemas.microsoft.com/office/drawing/2016/5/10/chartex" xmlns:cx5="http://schemas.microsoft.com/office/drawing/2016/5/11/chartex" xmlns:cx6="http://schemas.microsoft.com/office/drawing/2016/5/12/chartex" xmlns:cx7="http://schemas.microsoft.com/office/drawing/2016/5/13/chartex" xmlns:cx8="http://schemas.microsoft.com/office/drawing/2016/5/14/chartex" xmlns:mc="http://schemas.openxmlformats.org/markup-compatibility/2006" xmlns:m="http://schemas.openxmlformats.org/officeDocument/2006/math" xmlns:aink="http://schemas.microsoft.com/office/drawing/2016/ink" xmlns:am3d="http://schemas.microsoft.com/office/drawing/2017/model3d" xmlns:oel="http://schemas.microsoft.com/office/2019/extlst" xmlns:r="http://schemas.openxmlformats.org/officeDocument/2006/relationships" xmlns:wp14="http://schemas.microsoft.com/office/word/2010/wordprocessingDrawing" xmlns:wp="http://schemas.openxmlformats.org/drawingml/2006/wordprocessingDrawing" xmlns:wpg="http://schemas.microsoft.com/office/word/2010/wordprocessingGroup" xmlns:wpi="http://schemas.microsoft.com/office/word/2010/wordprocessingInk" xmlns:wps="http://schemas.microsoft.com/office/word/2010/wordprocessingShape" xmlns:o="urn:schemas-microsoft-com:office:office" xmlns:v="urn:schemas-microsoft-com:vml" xmlns:w10="urn:schemas-microsoft-com:office:word" xmlns:w="http://schemas.openxmlformats.org/wordprocessingml/2006/main" xmlns:w14="http://schemas.microsoft.com/office/word/2010/wordml" xmlns:w15="http://schemas.microsoft.com/office/word/2012/wordml" xmlns:w16cex="http://schemas.microsoft.com/office/word/2018/wordml/cex" xmlns:w16cid="http://schemas.microsoft.com/office/word/2016/wordml/cid" xmlns:w16="http://schemas.microsoft.com/office/word/2018/wordml" xmlns:w16sdtdh="http://schemas.microsoft.com/office/word/2020/wordml/sdtdatahash" xmlns:w16sdtfl="http://schemas.microsoft.com/office/word/2024/wordml/sdtformatlock" xmlns:w16se="http://schemas.microsoft.com/office/word/2015/wordml/symex" xmlns:w16du="http://schemas.microsoft.com/office/word/2023/wordml/word16du" xmlns:wne="http://schemas.microsoft.com/office/word/2006/wordml" mc:Ignorable="w14 w15 w16se w16cid w16 w16cex w16sdtdh w16sdtfl w16du wp14">
-  <w:p>
-    <w:pPr>
-      <w:pStyle w:val="Footer"/>
-    </w:pPr>
-    <w:r>
-      <w:rPr>
-        <w:noProof/>
-      </w:rPr>
-      <mc:AlternateContent>
-        <mc:Choice Requires="wps">
-          <w:drawing>
-            <wp:anchor distT="0" distB="0" distL="0" distR="0" simplePos="0" relativeHeight="251658240" behindDoc="0" locked="0" layoutInCell="1" allowOverlap="1" wp14:anchorId="34EDA1DF" wp14:editId="18BA2A67">
-              <wp:simplePos x="635" y="635"/>
-              <wp:positionH relativeFrom="page">
-                <wp:align>left</wp:align>
-              </wp:positionH>
-              <wp:positionV relativeFrom="page">
-                <wp:align>bottom</wp:align>
-              </wp:positionV>
-              <wp:extent cx="813435" cy="345440"/>
-              <wp:effectExtent l="0" t="0" r="12065" b="0"/>
-              <wp:wrapNone/>
-              <wp:docPr id="1597955064" name="Text Box 13" descr="INTERNAL ">
-                <a:extLst xmlns:a="http://schemas.openxmlformats.org/drawingml/2006/main">
-                  <a:ext uri="{5AE41FA2-C0FF-4470-9BD4-5FADCA87CBE2}">
-                    <aclsh:classification xmlns:aclsh="http://schemas.microsoft.com/office/drawing/2020/classificationShape" classificationOutcomeType="ftr"/>
-                  </a:ext>
-                </a:extLst>
-              </wp:docPr>
-              <wp:cNvGraphicFramePr/>
-              <a:graphic xmlns:a="http://schemas.openxmlformats.org/drawingml/2006/main">
-                <a:graphicData uri="http://schemas.microsoft.com/office/word/2010/wordprocessingShape">
-                  <wps:wsp>
-                    <wps:cNvSpPr txBox="1"/>
-                    <wps:spPr>
-                      <a:xfrm>
-                        <a:off x="0" y="0"/>
-                        <a:ext cx="813435" cy="345440"/>
-                      </a:xfrm>
-                      <a:prstGeom prst="rect">
-                        <a:avLst/>
-                      </a:prstGeom>
-                      <a:noFill/>
-                      <a:ln>
-                        <a:noFill/>
-                      </a:ln>
-                    </wps:spPr>
-                    <wps:txbx>
-                      <w:txbxContent>
-                        <w:p>
-                          <w:pPr>
-                            <w:rPr>
-                              <w:rFonts w:ascii="Aptos" w:eastAsia="Aptos" w:hAnsi="Aptos" w:cs="Aptos"/>
-                              <w:noProof/>
-                              <w:color w:val="000000"/>
-                              <w:sz w:val="20"/>
-                              <w:szCs w:val="20"/>
-                            </w:rPr>
-                          </w:pPr>
-                          <w:r>
-                            <w:rPr>
-                              <w:rFonts w:ascii="Aptos" w:eastAsia="Aptos" w:hAnsi="Aptos" w:cs="Aptos"/>
-                              <w:noProof/>
-                              <w:color w:val="000000"/>
-                              <w:sz w:val="20"/>
-                              <w:szCs w:val="20"/>
-                            </w:rPr>
-                            <w:t xml:space="preserve">INTERNAL </w:t>
-                          </w:r>
-                        </w:p>
-                      </w:txbxContent>
-                    </wps:txbx>
-                    <wps:bodyPr rot="0" spcFirstLastPara="0" vertOverflow="overflow" horzOverflow="overflow" vert="horz" wrap="none" lIns="254000" tIns="0" rIns="0" bIns="190500" numCol="1" spcCol="0" rtlCol="0" fromWordArt="0" anchor="b" anchorCtr="0" forceAA="0" compatLnSpc="1">
-                      <a:prstTxWarp prst="textNoShape">
-                        <a:avLst/>
-                      </a:prstTxWarp>
-                      <a:spAutoFit/>
-                    </wps:bodyPr>
-                  </wps:wsp>
-                </a:graphicData>
-              </a:graphic>
-            </wp:anchor>
-          </w:drawing>
-        </mc:Choice>
-        <mc:Fallback>
-          <w:pict>
-            <v:shapetype w14:anchorId="34EDA1DF" id="_x0000_t202" coordsize="21600,21600" o:spt="202" path="m,l,21600r21600,l21600,xe">
-              <v:stroke joinstyle="miter"/>
-              <v:path gradientshapeok="t" o:connecttype="rect"/>
-            </v:shapetype>
-            <v:shape id="Text Box 13" o:spid="_x0000_s1028" type="#_x0000_t202" alt="INTERNAL " style="position:absolute;margin-left:0;margin-top:0;width:64.05pt;height:27.2pt;z-index:251658240;visibility:visible;mso-wrap-style:none;mso-wrap-distance-left:0;mso-wrap-distance-top:0;mso-wrap-distance-right:0;mso-wrap-distance-bottom:0;mso-position-horizontal:left;mso-position-horizontal-relative:page;mso-position-vertical:bottom;mso-position-vertical-relative:page;v-text-anchor:bottom" o:gfxdata="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" filled="f" stroked="f">
-              <v:textbox style="mso-fit-shape-to-text:t" inset="20pt,0,0,15pt">
-                <w:txbxContent>
-                  <w:p>
-                    <w:pPr>
-                      <w:rPr>
-                        <w:rFonts w:ascii="Aptos" w:eastAsia="Aptos" w:hAnsi="Aptos" w:cs="Aptos"/>
-                        <w:noProof/>
-                        <w:color w:val="000000"/>
-                        <w:sz w:val="20"/>
-                        <w:szCs w:val="20"/>
-                      </w:rPr>
-                    </w:pPr>
-                    <w:r>
-                      <w:rPr>
-                        <w:rFonts w:ascii="Aptos" w:eastAsia="Aptos" w:hAnsi="Aptos" w:cs="Aptos"/>
-                        <w:noProof/>
-                        <w:color w:val="000000"/>
-                        <w:sz w:val="20"/>
-                        <w:szCs w:val="20"/>
-                      </w:rPr>
-                      <w:t xml:space="preserve">INTERNAL </w:t>
-                    </w:r>
-                  </w:p>
-                </w:txbxContent>
-              </v:textbox>
-              <w10:wrap anchorx="page" anchory="page"/>
-            </v:shape>
-          </w:pict>
-        </mc:Fallback>
-      </mc:AlternateContent>
-    </w:r>
-  </w:p>
+<w:ftr xmlns:w="http://schemas.openxmlformats.org/wordprocessingml/2006/main">
+  <w:p/>
 </w:ftr>
 </file>
 

</xml_diff>